<commit_message>
docs: PPS 10/11 adaptada a Ubuntu 26.04 (no usar Bandit de apt) y opciones de ampliación
</commit_message>
<xml_diff>
--- a/PPS/practicas/PPS-bandit-10-11-2026.docx
+++ b/PPS/practicas/PPS-bandit-10-11-2026.docx
@@ -171,7 +171,7 @@
     </w:p>
     <w:p>
       <w:r>
-        <w:t>Equipo: tu Ubuntu del aula o tu portátil con Python 3.10 o superior. No necesitas Docker ni Git.</w:t>
+        <w:t>Equipo: tu Ubuntu 26.04 del aula (trae Python 3.14) o tu portátil con Python 3.10 o superior. Trabaja en el Ubuntu, no en la Kali. No necesitas Docker ni Git.</w:t>
       </w:r>
     </w:p>
     <w:p>
@@ -2256,6 +2256,73 @@
     </w:p>
     <w:p>
       <w:r>
+        <w:rPr>
+          <w:rFonts w:ascii="Courier New" w:hAnsi="Courier New" w:eastAsia="Courier New"/>
+          <w:sz w:val="20"/>
+        </w:rPr>
+        <w:t>The virtual environment was not created successfully because ensurepip is not available</w:t>
+      </w:r>
+      <w:r>
+        <w:t xml:space="preserve">: a tu Ubuntu le falta el paquete de entornos virtuales. Instálalo con </w:t>
+      </w:r>
+      <w:r>
+        <w:rPr>
+          <w:rFonts w:ascii="Courier New" w:hAnsi="Courier New" w:eastAsia="Courier New"/>
+          <w:sz w:val="20"/>
+        </w:rPr>
+        <w:t>sudo apt install python3-venv</w:t>
+      </w:r>
+      <w:r>
+        <w:t xml:space="preserve"> y vuelve a crear el entorno.</w:t>
+      </w:r>
+    </w:p>
+    <w:p>
+      <w:r>
+        <w:t xml:space="preserve">Bandit termina con </w:t>
+      </w:r>
+      <w:r>
+        <w:rPr>
+          <w:rFonts w:ascii="Courier New" w:hAnsi="Courier New" w:eastAsia="Courier New"/>
+          <w:sz w:val="20"/>
+        </w:rPr>
+        <w:t>No issues identified</w:t>
+      </w:r>
+      <w:r>
+        <w:t xml:space="preserve"> pero, más abajo, aparece </w:t>
+      </w:r>
+      <w:r>
+        <w:rPr>
+          <w:rFonts w:ascii="Courier New" w:hAnsi="Courier New" w:eastAsia="Courier New"/>
+          <w:sz w:val="20"/>
+        </w:rPr>
+        <w:t>Files skipped</w:t>
+      </w:r>
+      <w:r>
+        <w:t xml:space="preserve"> con </w:t>
+      </w:r>
+      <w:r>
+        <w:rPr>
+          <w:rFonts w:ascii="Courier New" w:hAnsi="Courier New" w:eastAsia="Courier New"/>
+          <w:sz w:val="20"/>
+        </w:rPr>
+        <w:t>exception while scanning file</w:t>
+      </w:r>
+      <w:r>
+        <w:t xml:space="preserve">: no ha analizado esos ficheros, así que ese cero no vale nada. Suele pasar con una versión de Bandit que no entiende tu versión de Python. Comprueba con </w:t>
+      </w:r>
+      <w:r>
+        <w:rPr>
+          <w:rFonts w:ascii="Courier New" w:hAnsi="Courier New" w:eastAsia="Courier New"/>
+          <w:sz w:val="20"/>
+        </w:rPr>
+        <w:t>which bandit</w:t>
+      </w:r>
+      <w:r>
+        <w:t xml:space="preserve"> que estás usando el del entorno y no el del sistema.</w:t>
+      </w:r>
+    </w:p>
+    <w:p>
+      <w:r>
         <w:t xml:space="preserve">Bandit no hace caso a </w:t>
       </w:r>
       <w:r>
@@ -2333,27 +2400,47 @@
     </w:p>
     <w:p>
       <w:r>
-        <w:t xml:space="preserve">Sin Internet en el aula: en Ubuntu puedes instalar las herramientas con </w:t>
+        <w:t xml:space="preserve">No instales Bandit con </w:t>
       </w:r>
       <w:r>
         <w:rPr>
           <w:rFonts w:ascii="Courier New" w:hAnsi="Courier New" w:eastAsia="Courier New"/>
           <w:sz w:val="20"/>
         </w:rPr>
-        <w:t>sudo apt install bandit python3-pytest</w:t>
-      </w:r>
-      <w:r>
-        <w:t xml:space="preserve"> y usarlas sin entorno virtual. Ten en cuenta que en Ubuntu 24.04 ese paquete es Bandit 1.6.2, bastante más antiguo que el de pip: el número de avisos, algunos mensajes y la lectura de </w:t>
+        <w:t>apt</w:t>
+      </w:r>
+      <w:r>
+        <w:t xml:space="preserve">. En Ubuntu 26.04 ese paquete es Bandit 1.7.10 y con Python 3.14 se salta todos los ficheros: dice que no hay ningún aviso y termina como si todo fuera bien. Instálalo siempre en el entorno virtual con </w:t>
       </w:r>
       <w:r>
         <w:rPr>
           <w:rFonts w:ascii="Courier New" w:hAnsi="Courier New" w:eastAsia="Courier New"/>
           <w:sz w:val="20"/>
         </w:rPr>
-        <w:t>pyproject.toml</w:t>
-      </w:r>
-      <w:r>
-        <w:t xml:space="preserve"> pueden cambiar, así que no te saldrá exactamente lo que dice esta hoja. Anota la versión en el informe y, en cuanto tengas Internet, repite el análisis con el entorno virtual.</w:t>
+        <w:t>pip</w:t>
+      </w:r>
+      <w:r>
+        <w:t xml:space="preserve">. Si en el aula no hay Internet, avísame y te paso los paquetes para instalarlos sin conexión. </w:t>
+      </w:r>
+      <w:r>
+        <w:rPr>
+          <w:rFonts w:ascii="Courier New" w:hAnsi="Courier New" w:eastAsia="Courier New"/>
+          <w:sz w:val="20"/>
+        </w:rPr>
+        <w:t>pytest</w:t>
+      </w:r>
+      <w:r>
+        <w:t xml:space="preserve"> sí puedes instalarlo con </w:t>
+      </w:r>
+      <w:r>
+        <w:rPr>
+          <w:rFonts w:ascii="Courier New" w:hAnsi="Courier New" w:eastAsia="Courier New"/>
+          <w:sz w:val="20"/>
+        </w:rPr>
+        <w:t>sudo apt install python3-pytest</w:t>
+      </w:r>
+      <w:r>
+        <w:t xml:space="preserve"> si lo necesitas.</w:t>
       </w:r>
     </w:p>
     <w:p>
@@ -2422,18 +2509,15 @@
     </w:p>
     <w:p>
       <w:r>
-        <w:t>Si has terminado, elige una:</w:t>
+        <w:t>Si has terminado, elige una de estas dos opciones.</w:t>
       </w:r>
     </w:p>
     <w:p>
-      <w:pPr>
-        <w:pStyle w:val="ListNumber"/>
-      </w:pPr>
       <w:r>
         <w:rPr>
           <w:b/>
         </w:rPr>
-        <w:t>Línea base.</w:t>
+        <w:t>Opción A, línea base.</w:t>
       </w:r>
       <w:r>
         <w:t xml:space="preserve"> En un proyecto grande no se pueden corregir cuatrocientos avisos de golpe, pero sí se puede impedir que aparezcan avisos nuevos. Con el código original, genera un informe JSON y úsalo como línea base:</w:t>
@@ -2507,14 +2591,11 @@
       </w:r>
     </w:p>
     <w:p>
-      <w:pPr>
-        <w:pStyle w:val="ListNumber"/>
-      </w:pPr>
       <w:r>
         <w:rPr>
           <w:b/>
         </w:rPr>
-        <w:t>Opciones del ping.</w:t>
+        <w:t>Opción B, opciones del ping.</w:t>
       </w:r>
       <w:r>
         <w:t xml:space="preserve"> Aunque quites </w:t>

</xml_diff>